<commit_message>
docs: how to build OTA bin
</commit_message>
<xml_diff>
--- a/Build OTA Image Bin.docx
+++ b/Build OTA Image Bin.docx
@@ -68,10 +68,49 @@
         <w:t>Set-Location "C:\Users\MMDev\Documents\GitHub\SeadragonS3"</w:t>
       </w:r>
     </w:p>
+    <w:p>
+      <w:r>
+        <w:t>.\firmware\</w:t>
+      </w:r>
+      <w:proofErr w:type="spellStart"/>
+      <w:r>
+        <w:t>ota</w:t>
+      </w:r>
+      <w:proofErr w:type="spellEnd"/>
+      <w:r>
+        <w:t>\build-managed.ps1 -</w:t>
+      </w:r>
+      <w:proofErr w:type="spellStart"/>
+      <w:r>
+        <w:t>NFInterpreterRoot</w:t>
+      </w:r>
+      <w:proofErr w:type="spellEnd"/>
+      <w:r>
+        <w:t xml:space="preserve"> $</w:t>
+      </w:r>
+      <w:proofErr w:type="spellStart"/>
+      <w:r>
+        <w:t>nfRoot</w:t>
+      </w:r>
+      <w:proofErr w:type="spellEnd"/>
+    </w:p>
     <w:p/>
     <w:p>
       <w:r>
-        <w:t>.\firmware\</w:t>
+        <w:t>New-Item -ItemType Directory -Force `</w:t>
+      </w:r>
+    </w:p>
+    <w:p>
+      <w:r>
+        <w:t xml:space="preserve">  "$</w:t>
+      </w:r>
+      <w:proofErr w:type="spellStart"/>
+      <w:r>
+        <w:t>nfRoot</w:t>
+      </w:r>
+      <w:proofErr w:type="spellEnd"/>
+      <w:r>
+        <w:t>\build\</w:t>
       </w:r>
       <w:proofErr w:type="spellStart"/>
       <w:r>
@@ -79,37 +118,32 @@
       </w:r>
       <w:proofErr w:type="spellEnd"/>
       <w:r>
-        <w:t>\build-managed.ps1 -</w:t>
-      </w:r>
-      <w:proofErr w:type="spellStart"/>
-      <w:r>
-        <w:t>NFInterpreterRoot</w:t>
-      </w:r>
-      <w:proofErr w:type="spellEnd"/>
-      <w:r>
-        <w:t xml:space="preserve"> $</w:t>
+        <w:t>-validation" | Out-Null</w:t>
+      </w:r>
+    </w:p>
+    <w:p/>
+    <w:p>
+      <w:r>
+        <w:t>Copy-Item ".\SeadragonS3\bin\Release\</w:t>
+      </w:r>
+      <w:proofErr w:type="spellStart"/>
+      <w:r>
+        <w:t>application.bin</w:t>
+      </w:r>
+      <w:proofErr w:type="spellEnd"/>
+      <w:r>
+        <w:t>" `</w:t>
+      </w:r>
+    </w:p>
+    <w:p>
+      <w:r>
+        <w:t xml:space="preserve">  "$</w:t>
       </w:r>
       <w:proofErr w:type="spellStart"/>
       <w:r>
         <w:t>nfRoot</w:t>
       </w:r>
       <w:proofErr w:type="spellEnd"/>
-    </w:p>
-    <w:p/>
-    <w:p>
-      <w:r>
-        <w:t>New-Item -ItemType Directory -Force `</w:t>
-      </w:r>
-    </w:p>
-    <w:p>
-      <w:r>
-        <w:t xml:space="preserve">  "$</w:t>
-      </w:r>
-      <w:proofErr w:type="spellStart"/>
-      <w:r>
-        <w:t>nfRoot</w:t>
-      </w:r>
-      <w:proofErr w:type="spellEnd"/>
       <w:r>
         <w:t>\build\</w:t>
       </w:r>
@@ -119,13 +153,7 @@
       </w:r>
       <w:proofErr w:type="spellEnd"/>
       <w:r>
-        <w:t>-validation" | Out-Null</w:t>
-      </w:r>
-    </w:p>
-    <w:p/>
-    <w:p>
-      <w:r>
-        <w:t>Copy-Item ".\SeadragonS3\bin\Release\</w:t>
+        <w:t>-validation\</w:t>
       </w:r>
       <w:proofErr w:type="spellStart"/>
       <w:r>
@@ -133,37 +161,16 @@
       </w:r>
       <w:proofErr w:type="spellEnd"/>
       <w:r>
-        <w:t>" `</w:t>
-      </w:r>
-    </w:p>
-    <w:p>
-      <w:r>
-        <w:t xml:space="preserve">  "$</w:t>
-      </w:r>
-      <w:proofErr w:type="spellStart"/>
-      <w:r>
-        <w:t>nfRoot</w:t>
-      </w:r>
-      <w:proofErr w:type="spellEnd"/>
-      <w:r>
-        <w:t>\build\</w:t>
-      </w:r>
-      <w:proofErr w:type="spellStart"/>
-      <w:r>
-        <w:t>ota</w:t>
-      </w:r>
-      <w:proofErr w:type="spellEnd"/>
-      <w:r>
-        <w:t>-validation\</w:t>
-      </w:r>
-      <w:proofErr w:type="spellStart"/>
-      <w:r>
-        <w:t>application.bin</w:t>
-      </w:r>
-      <w:proofErr w:type="spellEnd"/>
-      <w:r>
         <w:t>" -Force</w:t>
       </w:r>
+    </w:p>
+    <w:p>
+      <w:pPr>
+        <w:rPr>
+          <w:b/>
+          <w:bCs/>
+        </w:rPr>
+      </w:pPr>
     </w:p>
     <w:p>
       <w:r>

</xml_diff>

<commit_message>
feat: prevent race condition with UART + speed up firmware installer
</commit_message>
<xml_diff>
--- a/Build OTA Image Bin.docx
+++ b/Build OTA Image Bin.docx
@@ -193,7 +193,19 @@
         <w:t>new release ID for every OTA attempt</w:t>
       </w:r>
       <w:r>
-        <w:t xml:space="preserve">, including retries after a failed update. IDs must contain 1–16 characters without spaces. The example below uses 20261021-02; use the </w:t>
+        <w:t>, including retries after a failed update. IDs must contain 1–16 characters without spaces. The example below uses 2026102</w:t>
+      </w:r>
+      <w:r>
+        <w:t>2</w:t>
+      </w:r>
+      <w:r>
+        <w:t>-0</w:t>
+      </w:r>
+      <w:r>
+        <w:t>2</w:t>
+      </w:r>
+      <w:r>
+        <w:t xml:space="preserve">; use the </w:t>
       </w:r>
       <w:r>
         <w:rPr>
@@ -279,7 +291,19 @@
     </w:p>
     <w:p>
       <w:r>
-        <w:t xml:space="preserve">  -DNF_PRODUCT_RELEASE_ID=20261021-02 \</w:t>
+        <w:t xml:space="preserve">  -DNF_PRODUCT_RELEASE_ID=2026102</w:t>
+      </w:r>
+      <w:r>
+        <w:t>2</w:t>
+      </w:r>
+      <w:r>
+        <w:t>-0</w:t>
+      </w:r>
+      <w:r>
+        <w:t>4</w:t>
+      </w:r>
+      <w:r>
+        <w:t xml:space="preserve"> \</w:t>
       </w:r>
     </w:p>
     <w:p>
@@ -428,7 +452,19 @@
     </w:p>
     <w:p>
       <w:r>
-        <w:t xml:space="preserve">  --release-id 20261021-02 `</w:t>
+        <w:t xml:space="preserve">  --release-id 2026102</w:t>
+      </w:r>
+      <w:r>
+        <w:t>2</w:t>
+      </w:r>
+      <w:r>
+        <w:t>-0</w:t>
+      </w:r>
+      <w:r>
+        <w:t>4</w:t>
+      </w:r>
+      <w:r>
+        <w:t xml:space="preserve"> `</w:t>
       </w:r>
     </w:p>
     <w:p>
@@ -606,6 +642,54 @@
       </w:r>
       <w:r>
         <w:t xml:space="preserve"> Keep the VS deployment flag ON, and keep the release ID and managed binary identical between the native build and packaging steps.</w:t>
+      </w:r>
+    </w:p>
+    <w:p/>
+    <w:p>
+      <w:r>
+        <w:rPr>
+          <w:b/>
+          <w:bCs/>
+        </w:rPr>
+        <w:t>5. To get debug output:</w:t>
+      </w:r>
+      <w:r>
+        <w:br/>
+      </w:r>
+      <w:r>
+        <w:br/>
+      </w:r>
+      <w:proofErr w:type="spellStart"/>
+      <w:r>
+        <w:t>py</w:t>
+      </w:r>
+      <w:proofErr w:type="spellEnd"/>
+      <w:r>
+        <w:t xml:space="preserve"> -m </w:t>
+      </w:r>
+      <w:proofErr w:type="spellStart"/>
+      <w:r>
+        <w:t>serial.tools.miniterm</w:t>
+      </w:r>
+      <w:proofErr w:type="spellEnd"/>
+      <w:r>
+        <w:t xml:space="preserve"> COM5 921600 --</w:t>
+      </w:r>
+      <w:proofErr w:type="spellStart"/>
+      <w:r>
+        <w:t>dtr</w:t>
+      </w:r>
+      <w:proofErr w:type="spellEnd"/>
+      <w:r>
+        <w:t xml:space="preserve"> 0 --</w:t>
+      </w:r>
+      <w:proofErr w:type="spellStart"/>
+      <w:r>
+        <w:t>rts</w:t>
+      </w:r>
+      <w:proofErr w:type="spellEnd"/>
+      <w:r>
+        <w:t xml:space="preserve"> 0</w:t>
       </w:r>
     </w:p>
     <w:p/>
@@ -1222,6 +1306,7 @@
   <w:style w:type="character" w:default="1" w:styleId="DefaultParagraphFont">
     <w:name w:val="Default Paragraph Font"/>
     <w:uiPriority w:val="1"/>
+    <w:semiHidden/>
     <w:unhideWhenUsed/>
   </w:style>
   <w:style w:type="table" w:default="1" w:styleId="TableNormal">
@@ -1533,6 +1618,36 @@
       <w:smallCaps/>
       <w:color w:val="0F4761" w:themeColor="accent1" w:themeShade="BF"/>
       <w:spacing w:val="5"/>
+    </w:rPr>
+  </w:style>
+  <w:style w:type="paragraph" w:styleId="HTMLPreformatted">
+    <w:name w:val="HTML Preformatted"/>
+    <w:basedOn w:val="Normal"/>
+    <w:link w:val="HTMLPreformattedChar"/>
+    <w:uiPriority w:val="99"/>
+    <w:semiHidden/>
+    <w:unhideWhenUsed/>
+    <w:rsid w:val="000B69CF"/>
+    <w:pPr>
+      <w:spacing w:after="0" w:line="240" w:lineRule="auto"/>
+    </w:pPr>
+    <w:rPr>
+      <w:rFonts w:ascii="Consolas" w:hAnsi="Consolas"/>
+      <w:sz w:val="20"/>
+      <w:szCs w:val="20"/>
+    </w:rPr>
+  </w:style>
+  <w:style w:type="character" w:customStyle="1" w:styleId="HTMLPreformattedChar">
+    <w:name w:val="HTML Preformatted Char"/>
+    <w:basedOn w:val="DefaultParagraphFont"/>
+    <w:link w:val="HTMLPreformatted"/>
+    <w:uiPriority w:val="99"/>
+    <w:semiHidden/>
+    <w:rsid w:val="000B69CF"/>
+    <w:rPr>
+      <w:rFonts w:ascii="Consolas" w:hAnsi="Consolas"/>
+      <w:sz w:val="20"/>
+      <w:szCs w:val="20"/>
     </w:rPr>
   </w:style>
 </w:styles>

</xml_diff>

<commit_message>
feat: enable temp sensor and brownout detection
</commit_message>
<xml_diff>
--- a/Build OTA Image Bin.docx
+++ b/Build OTA Image Bin.docx
@@ -294,13 +294,13 @@
         <w:t xml:space="preserve">  -DNF_PRODUCT_RELEASE_ID=2026102</w:t>
       </w:r>
       <w:r>
-        <w:t>2</w:t>
+        <w:t>6</w:t>
       </w:r>
       <w:r>
         <w:t>-0</w:t>
       </w:r>
       <w:r>
-        <w:t>4</w:t>
+        <w:t>1</w:t>
       </w:r>
       <w:r>
         <w:t xml:space="preserve"> \</w:t>
@@ -455,13 +455,13 @@
         <w:t xml:space="preserve">  --release-id 2026102</w:t>
       </w:r>
       <w:r>
-        <w:t>2</w:t>
+        <w:t>6</w:t>
       </w:r>
       <w:r>
         <w:t>-0</w:t>
       </w:r>
       <w:r>
-        <w:t>4</w:t>
+        <w:t>1</w:t>
       </w:r>
       <w:r>
         <w:t xml:space="preserve"> `</w:t>

</xml_diff>